<commit_message>
Yom Kippur and quotes
</commit_message>
<xml_diff>
--- a/Files/06 - Yom Tov/10 - Yom Kippur/5784/Yom Kippur 5784.docx
+++ b/Files/06 - Yom Tov/10 - Yom Kippur/5784/Yom Kippur 5784.docx
@@ -12,7 +12,7 @@
         <w:rPr>
           <w:rFonts w:ascii="Times New Roman" w:hAnsi="Times New Roman" w:cs="Times New Roman"/>
         </w:rPr>
-        <w:t>Yom Kippur 5784</w:t>
+        <w:t>Yom Kipper 5784</w:t>
       </w:r>
     </w:p>
     <w:p>
@@ -109,7 +109,19 @@
         <w:rPr>
           <w:rFonts w:ascii="Times New Roman" w:hAnsi="Times New Roman" w:cs="Times New Roman"/>
         </w:rPr>
-        <w:t xml:space="preserve">, to be </w:t>
+        <w:t>,</w:t>
+      </w:r>
+      <w:r>
+        <w:rPr>
+          <w:rFonts w:ascii="Times New Roman" w:hAnsi="Times New Roman" w:cs="Times New Roman"/>
+        </w:rPr>
+        <w:t xml:space="preserve"> for example,</w:t>
+      </w:r>
+      <w:r>
+        <w:rPr>
+          <w:rFonts w:ascii="Times New Roman" w:hAnsi="Times New Roman" w:cs="Times New Roman"/>
+        </w:rPr>
+        <w:t xml:space="preserve"> to be </w:t>
       </w:r>
       <w:r>
         <w:rPr>
@@ -155,48 +167,13 @@
         <w:rPr>
           <w:rFonts w:ascii="Times New Roman" w:hAnsi="Times New Roman" w:cs="Times New Roman"/>
         </w:rPr>
-        <w:t xml:space="preserve">. If we go out of our way to be </w:t>
-      </w:r>
-      <w:r>
-        <w:rPr>
-          <w:rFonts w:ascii="Times New Roman" w:hAnsi="Times New Roman" w:cs="Times New Roman" w:hint="cs"/>
-          <w:rtl/>
-        </w:rPr>
-        <w:t>לפנים</w:t>
-      </w:r>
-      <w:r>
-        <w:rPr>
-          <w:rFonts w:ascii="Times New Roman" w:hAnsi="Times New Roman" w:cs="Times New Roman"/>
-          <w:rtl/>
-        </w:rPr>
-        <w:t xml:space="preserve"> </w:t>
-      </w:r>
-      <w:r>
-        <w:rPr>
-          <w:rFonts w:ascii="Times New Roman" w:hAnsi="Times New Roman" w:cs="Times New Roman" w:hint="cs"/>
-          <w:rtl/>
-        </w:rPr>
-        <w:t>משורת</w:t>
-      </w:r>
-      <w:r>
-        <w:rPr>
-          <w:rFonts w:ascii="Times New Roman" w:hAnsi="Times New Roman" w:cs="Times New Roman"/>
-          <w:rtl/>
-        </w:rPr>
-        <w:t xml:space="preserve"> </w:t>
-      </w:r>
-      <w:r>
-        <w:rPr>
-          <w:rFonts w:ascii="Times New Roman" w:hAnsi="Times New Roman" w:cs="Times New Roman" w:hint="cs"/>
-          <w:rtl/>
-        </w:rPr>
-        <w:t>הדין</w:t>
-      </w:r>
-      <w:r>
-        <w:rPr>
-          <w:rFonts w:ascii="Times New Roman" w:hAnsi="Times New Roman" w:cs="Times New Roman"/>
-        </w:rPr>
-        <w:t xml:space="preserve">, to be </w:t>
+        <w:t xml:space="preserve">. If we go out of our way </w:t>
+      </w:r>
+      <w:r>
+        <w:rPr>
+          <w:rFonts w:ascii="Times New Roman" w:hAnsi="Times New Roman" w:cs="Times New Roman"/>
+        </w:rPr>
+        <w:t xml:space="preserve">to be </w:t>
       </w:r>
       <w:r>
         <w:rPr>
@@ -257,7 +234,7 @@
         <w:rPr>
           <w:rFonts w:ascii="Times New Roman" w:hAnsi="Times New Roman" w:cs="Times New Roman"/>
         </w:rPr>
-        <w:t xml:space="preserve">illustrates this in a very powerful way. </w:t>
+        <w:t xml:space="preserve">illustrates this in a powerful way. </w:t>
       </w:r>
     </w:p>
     <w:p>
@@ -697,7 +674,7 @@
         <w:rPr>
           <w:rFonts w:ascii="Times New Roman" w:hAnsi="Times New Roman" w:cs="Times New Roman"/>
         </w:rPr>
-        <w:t xml:space="preserve"> to be at the time an all-time low due to a dip in the market. Once again, </w:t>
+        <w:t xml:space="preserve"> to be at an all-time low due to a dip in the market. Once again, </w:t>
       </w:r>
       <w:r>
         <w:rPr>
@@ -733,7 +710,7 @@
         <w:rPr>
           <w:rFonts w:ascii="Times New Roman" w:hAnsi="Times New Roman" w:cs="Times New Roman"/>
         </w:rPr>
-        <w:t xml:space="preserve">s market values soared. </w:t>
+        <w:t xml:space="preserve">s market value soared. </w:t>
       </w:r>
       <w:r>
         <w:rPr>
@@ -789,7 +766,7 @@
         <w:rPr>
           <w:rFonts w:ascii="Times New Roman" w:hAnsi="Times New Roman" w:cs="Times New Roman"/>
         </w:rPr>
-        <w:t xml:space="preserve">s calculate it and see that if I still owe if I still owe you anything." The calculation of the total value from the various slips of paper revealed that after all was said and done, </w:t>
+        <w:t xml:space="preserve">s calculate it and see if I still owe you anything." The calculation of the total value from the various slips of paper revealed that after all was said and done, </w:t>
       </w:r>
       <w:r>
         <w:rPr>
@@ -905,7 +882,19 @@
         <w:rPr>
           <w:rFonts w:ascii="Times New Roman" w:hAnsi="Times New Roman" w:cs="Times New Roman"/>
         </w:rPr>
-        <w:t xml:space="preserve"> breath nearly caught in his throat. Before him, standing and smiling joyfully, was his deceased mother. She looked at him with soft eyes and just smiled as if to say, you have made me so happy, my son. Then she disappeared. Sharing this story with him, with me, </w:t>
+        <w:t>’</w:t>
+      </w:r>
+      <w:r>
+        <w:rPr>
+          <w:rFonts w:ascii="Times New Roman" w:hAnsi="Times New Roman" w:cs="Times New Roman"/>
+        </w:rPr>
+        <w:t>s</w:t>
+      </w:r>
+      <w:r>
+        <w:rPr>
+          <w:rFonts w:ascii="Times New Roman" w:hAnsi="Times New Roman" w:cs="Times New Roman"/>
+        </w:rPr>
+        <w:t xml:space="preserve"> breath nearly caught in his throat. Before him, standing and smiling joyfully, was his deceased mother. She looked at him with soft eyes and just smiled as if to say, you have made me so happy, my son. Then she disappeared. Sharing this story with me, </w:t>
       </w:r>
       <w:r>
         <w:rPr>
@@ -1039,7 +1028,31 @@
         <w:rPr>
           <w:rFonts w:ascii="Times New Roman" w:hAnsi="Times New Roman" w:cs="Times New Roman"/>
         </w:rPr>
-        <w:t xml:space="preserve"> our whole family well, and in the </w:t>
+        <w:t xml:space="preserve"> our whole family well</w:t>
+      </w:r>
+      <w:r>
+        <w:rPr>
+          <w:rFonts w:ascii="Times New Roman" w:hAnsi="Times New Roman" w:cs="Times New Roman"/>
+        </w:rPr>
+        <w:t>.</w:t>
+      </w:r>
+      <w:r>
+        <w:rPr>
+          <w:rFonts w:ascii="Times New Roman" w:hAnsi="Times New Roman" w:cs="Times New Roman"/>
+        </w:rPr>
+        <w:t xml:space="preserve"> </w:t>
+      </w:r>
+      <w:r>
+        <w:rPr>
+          <w:rFonts w:ascii="Times New Roman" w:hAnsi="Times New Roman" w:cs="Times New Roman"/>
+        </w:rPr>
+        <w:t>I</w:t>
+      </w:r>
+      <w:r>
+        <w:rPr>
+          <w:rFonts w:ascii="Times New Roman" w:hAnsi="Times New Roman" w:cs="Times New Roman"/>
+        </w:rPr>
+        <w:t xml:space="preserve">n the </w:t>
       </w:r>
       <w:r>
         <w:rPr>
@@ -1093,7 +1106,13 @@
         <w:rPr>
           <w:rFonts w:ascii="Times New Roman" w:hAnsi="Times New Roman" w:cs="Times New Roman"/>
         </w:rPr>
-        <w:t xml:space="preserve">, may we have a </w:t>
+        <w:t>, may we have</w:t>
+      </w:r>
+      <w:r>
+        <w:rPr>
+          <w:rFonts w:ascii="Times New Roman" w:hAnsi="Times New Roman" w:cs="Times New Roman"/>
+        </w:rPr>
+        <w:t xml:space="preserve"> a </w:t>
       </w:r>
       <w:r>
         <w:rPr>

</xml_diff>